<commit_message>
WIP: fee proposal outputs from running agents
Co-Authored-By: Claude Opus 5.5 <noreply@anthropic.com>
Claude-Session: https://claude.ai/code/session_01RKGFyarCMuMinKYL7AiBap
</commit_message>
<xml_diff>
--- a/FP/BUYNSW-T026-2026/Architect-Teaming/JCE_Teaming_Architect-Teaming_Leppington_Final_Brewster-Hjorth.docx
+++ b/FP/BUYNSW-T026-2026/Architect-Teaming/JCE_Teaming_Architect-Teaming_Leppington_Final_Brewster-Hjorth.docx
@@ -159,7 +159,7 @@
               <w:rPr>
                 <w:sz w:val="19"/>
               </w:rPr>
-              <w:t>JCE-TB-T026 Rev B (Final)</w:t>
+              <w:t>JCE-TB-T026 Rev C (Final)</w:t>
             </w:r>
           </w:p>
         </w:tc>
@@ -1106,6 +1106,489 @@
     </w:p>
     <w:p>
       <w:pPr>
+        <w:keepNext/>
+        <w:spacing w:after="60"/>
+      </w:pPr>
+      <w:r>
+        <w:rPr>
+          <w:b w:val="0"/>
+          <w:i w:val="0"/>
+          <w:sz w:val="21"/>
+        </w:rPr>
+        <w:t>Schedule of rates for Schedule 3 (excl. GST). These are the rates used to build the lump sums.</w:t>
+      </w:r>
+    </w:p>
+    <w:tbl>
+      <w:tblPr>
+        <w:tblStyle w:val="TableGrid"/>
+        <w:tblW w:type="auto" w:w="0"/>
+        <w:tblLayout w:type="fixed"/>
+        <w:tblLook w:firstColumn="1" w:firstRow="1" w:lastColumn="0" w:lastRow="0" w:noHBand="0" w:noVBand="1" w:val="04A0"/>
+      </w:tblPr>
+      <w:tblGrid>
+        <w:gridCol w:w="5103"/>
+        <w:gridCol w:w="1984"/>
+        <w:gridCol w:w="2551"/>
+      </w:tblGrid>
+      <w:tr>
+        <w:trPr>
+          <w:cantSplit/>
+        </w:trPr>
+        <w:tc>
+          <w:tcPr>
+            <w:tcW w:type="dxa" w:w="5102"/>
+          </w:tcPr>
+          <w:p>
+            <w:pPr>
+              <w:keepNext/>
+            </w:pPr>
+            <w:r/>
+            <w:r>
+              <w:rPr>
+                <w:b/>
+                <w:sz w:val="19"/>
+              </w:rPr>
+              <w:t>Key personnel</w:t>
+            </w:r>
+          </w:p>
+        </w:tc>
+        <w:tc>
+          <w:tcPr>
+            <w:tcW w:type="dxa" w:w="1984"/>
+          </w:tcPr>
+          <w:p>
+            <w:pPr>
+              <w:keepNext/>
+            </w:pPr>
+            <w:r/>
+            <w:r>
+              <w:rPr>
+                <w:b/>
+                <w:sz w:val="19"/>
+              </w:rPr>
+              <w:t>Hourly rate</w:t>
+            </w:r>
+          </w:p>
+        </w:tc>
+        <w:tc>
+          <w:tcPr>
+            <w:tcW w:type="dxa" w:w="2551"/>
+          </w:tcPr>
+          <w:p>
+            <w:pPr>
+              <w:keepNext/>
+            </w:pPr>
+            <w:r/>
+            <w:r>
+              <w:rPr>
+                <w:b/>
+                <w:sz w:val="19"/>
+              </w:rPr>
+              <w:t>Site inspection (fixed)</w:t>
+            </w:r>
+          </w:p>
+        </w:tc>
+      </w:tr>
+      <w:tr>
+        <w:trPr>
+          <w:cantSplit/>
+        </w:trPr>
+        <w:tc>
+          <w:tcPr>
+            <w:tcW w:type="dxa" w:w="5102"/>
+          </w:tcPr>
+          <w:p>
+            <w:pPr>
+              <w:keepNext/>
+            </w:pPr>
+            <w:r/>
+            <w:r>
+              <w:rPr>
+                <w:sz w:val="19"/>
+              </w:rPr>
+              <w:t>Jayden Callen, Director and Principal Civil Engineer</w:t>
+            </w:r>
+          </w:p>
+        </w:tc>
+        <w:tc>
+          <w:tcPr>
+            <w:tcW w:type="dxa" w:w="1984"/>
+          </w:tcPr>
+          <w:p>
+            <w:pPr>
+              <w:keepNext/>
+            </w:pPr>
+            <w:r/>
+            <w:r>
+              <w:rPr>
+                <w:sz w:val="19"/>
+              </w:rPr>
+              <w:t>$200</w:t>
+            </w:r>
+          </w:p>
+        </w:tc>
+        <w:tc>
+          <w:tcPr>
+            <w:tcW w:type="dxa" w:w="2551"/>
+          </w:tcPr>
+          <w:p>
+            <w:pPr>
+              <w:keepNext/>
+            </w:pPr>
+            <w:r/>
+            <w:r>
+              <w:rPr>
+                <w:sz w:val="19"/>
+              </w:rPr>
+              <w:t>$1,900</w:t>
+            </w:r>
+          </w:p>
+        </w:tc>
+      </w:tr>
+      <w:tr>
+        <w:trPr>
+          <w:cantSplit/>
+        </w:trPr>
+        <w:tc>
+          <w:tcPr>
+            <w:tcW w:type="dxa" w:w="5102"/>
+          </w:tcPr>
+          <w:p>
+            <w:pPr>
+              <w:keepNext/>
+            </w:pPr>
+            <w:r/>
+            <w:r>
+              <w:rPr>
+                <w:sz w:val="19"/>
+              </w:rPr>
+              <w:t>Independent peer review (Livio Chiarot FIEAust)</w:t>
+            </w:r>
+          </w:p>
+        </w:tc>
+        <w:tc>
+          <w:tcPr>
+            <w:tcW w:type="dxa" w:w="1984"/>
+          </w:tcPr>
+          <w:p>
+            <w:pPr>
+              <w:keepNext/>
+            </w:pPr>
+            <w:r/>
+            <w:r>
+              <w:rPr>
+                <w:sz w:val="19"/>
+              </w:rPr>
+              <w:t>$200</w:t>
+            </w:r>
+          </w:p>
+        </w:tc>
+        <w:tc>
+          <w:tcPr>
+            <w:tcW w:type="dxa" w:w="2551"/>
+          </w:tcPr>
+          <w:p>
+            <w:pPr>
+              <w:keepNext/>
+            </w:pPr>
+            <w:r/>
+            <w:r>
+              <w:rPr>
+                <w:sz w:val="19"/>
+              </w:rPr>
+              <w:t>N/A</w:t>
+            </w:r>
+          </w:p>
+        </w:tc>
+      </w:tr>
+      <w:tr>
+        <w:trPr>
+          <w:cantSplit/>
+        </w:trPr>
+        <w:tc>
+          <w:tcPr>
+            <w:tcW w:type="dxa" w:w="5102"/>
+          </w:tcPr>
+          <w:p>
+            <w:pPr>
+              <w:keepNext/>
+            </w:pPr>
+            <w:r/>
+            <w:r>
+              <w:rPr>
+                <w:sz w:val="19"/>
+              </w:rPr>
+              <w:t>Senior Engineer</w:t>
+            </w:r>
+          </w:p>
+        </w:tc>
+        <w:tc>
+          <w:tcPr>
+            <w:tcW w:type="dxa" w:w="1984"/>
+          </w:tcPr>
+          <w:p>
+            <w:pPr>
+              <w:keepNext/>
+            </w:pPr>
+            <w:r/>
+            <w:r>
+              <w:rPr>
+                <w:sz w:val="19"/>
+              </w:rPr>
+              <w:t>$190</w:t>
+            </w:r>
+          </w:p>
+        </w:tc>
+        <w:tc>
+          <w:tcPr>
+            <w:tcW w:type="dxa" w:w="2551"/>
+          </w:tcPr>
+          <w:p>
+            <w:pPr>
+              <w:keepNext/>
+            </w:pPr>
+            <w:r/>
+            <w:r>
+              <w:rPr>
+                <w:sz w:val="19"/>
+              </w:rPr>
+              <w:t>$1,900</w:t>
+            </w:r>
+          </w:p>
+        </w:tc>
+      </w:tr>
+      <w:tr>
+        <w:trPr>
+          <w:cantSplit/>
+        </w:trPr>
+        <w:tc>
+          <w:tcPr>
+            <w:tcW w:type="dxa" w:w="5102"/>
+          </w:tcPr>
+          <w:p>
+            <w:pPr>
+              <w:keepNext/>
+            </w:pPr>
+            <w:r/>
+            <w:r>
+              <w:rPr>
+                <w:sz w:val="19"/>
+              </w:rPr>
+              <w:t>Project Engineer</w:t>
+            </w:r>
+          </w:p>
+        </w:tc>
+        <w:tc>
+          <w:tcPr>
+            <w:tcW w:type="dxa" w:w="1984"/>
+          </w:tcPr>
+          <w:p>
+            <w:pPr>
+              <w:keepNext/>
+            </w:pPr>
+            <w:r/>
+            <w:r>
+              <w:rPr>
+                <w:sz w:val="19"/>
+              </w:rPr>
+              <w:t>$180</w:t>
+            </w:r>
+          </w:p>
+        </w:tc>
+        <w:tc>
+          <w:tcPr>
+            <w:tcW w:type="dxa" w:w="2551"/>
+          </w:tcPr>
+          <w:p>
+            <w:pPr>
+              <w:keepNext/>
+            </w:pPr>
+            <w:r/>
+            <w:r>
+              <w:rPr>
+                <w:sz w:val="19"/>
+              </w:rPr>
+              <w:t>$1,900</w:t>
+            </w:r>
+          </w:p>
+        </w:tc>
+      </w:tr>
+      <w:tr>
+        <w:trPr>
+          <w:cantSplit/>
+        </w:trPr>
+        <w:tc>
+          <w:tcPr>
+            <w:tcW w:type="dxa" w:w="5102"/>
+          </w:tcPr>
+          <w:p>
+            <w:pPr>
+              <w:keepNext/>
+            </w:pPr>
+            <w:r/>
+            <w:r>
+              <w:rPr>
+                <w:sz w:val="19"/>
+              </w:rPr>
+              <w:t>Design Engineer</w:t>
+            </w:r>
+          </w:p>
+        </w:tc>
+        <w:tc>
+          <w:tcPr>
+            <w:tcW w:type="dxa" w:w="1984"/>
+          </w:tcPr>
+          <w:p>
+            <w:pPr>
+              <w:keepNext/>
+            </w:pPr>
+            <w:r/>
+            <w:r>
+              <w:rPr>
+                <w:sz w:val="19"/>
+              </w:rPr>
+              <w:t>$170</w:t>
+            </w:r>
+          </w:p>
+        </w:tc>
+        <w:tc>
+          <w:tcPr>
+            <w:tcW w:type="dxa" w:w="2551"/>
+          </w:tcPr>
+          <w:p>
+            <w:pPr>
+              <w:keepNext/>
+            </w:pPr>
+            <w:r/>
+            <w:r>
+              <w:rPr>
+                <w:sz w:val="19"/>
+              </w:rPr>
+              <w:t>N/A</w:t>
+            </w:r>
+          </w:p>
+        </w:tc>
+      </w:tr>
+      <w:tr>
+        <w:trPr>
+          <w:cantSplit/>
+        </w:trPr>
+        <w:tc>
+          <w:tcPr>
+            <w:tcW w:type="dxa" w:w="5102"/>
+          </w:tcPr>
+          <w:p>
+            <w:pPr>
+              <w:keepNext/>
+            </w:pPr>
+            <w:r/>
+            <w:r>
+              <w:rPr>
+                <w:sz w:val="19"/>
+              </w:rPr>
+              <w:t>CAD / Drafting Technician</w:t>
+            </w:r>
+          </w:p>
+        </w:tc>
+        <w:tc>
+          <w:tcPr>
+            <w:tcW w:type="dxa" w:w="1984"/>
+          </w:tcPr>
+          <w:p>
+            <w:pPr>
+              <w:keepNext/>
+            </w:pPr>
+            <w:r/>
+            <w:r>
+              <w:rPr>
+                <w:sz w:val="19"/>
+              </w:rPr>
+              <w:t>$160</w:t>
+            </w:r>
+          </w:p>
+        </w:tc>
+        <w:tc>
+          <w:tcPr>
+            <w:tcW w:type="dxa" w:w="2551"/>
+          </w:tcPr>
+          <w:p>
+            <w:pPr>
+              <w:keepNext/>
+            </w:pPr>
+            <w:r/>
+            <w:r>
+              <w:rPr>
+                <w:sz w:val="19"/>
+              </w:rPr>
+              <w:t>N/A</w:t>
+            </w:r>
+          </w:p>
+        </w:tc>
+      </w:tr>
+      <w:tr>
+        <w:trPr>
+          <w:cantSplit/>
+        </w:trPr>
+        <w:tc>
+          <w:tcPr>
+            <w:tcW w:type="dxa" w:w="5102"/>
+          </w:tcPr>
+          <w:p>
+            <w:pPr>
+              <w:keepNext/>
+            </w:pPr>
+            <w:r/>
+            <w:r>
+              <w:rPr>
+                <w:sz w:val="19"/>
+              </w:rPr>
+              <w:t>Administration / Document Control</w:t>
+            </w:r>
+          </w:p>
+        </w:tc>
+        <w:tc>
+          <w:tcPr>
+            <w:tcW w:type="dxa" w:w="1984"/>
+          </w:tcPr>
+          <w:p>
+            <w:pPr>
+              <w:keepNext/>
+            </w:pPr>
+            <w:r/>
+            <w:r>
+              <w:rPr>
+                <w:sz w:val="19"/>
+              </w:rPr>
+              <w:t>$140</w:t>
+            </w:r>
+          </w:p>
+        </w:tc>
+        <w:tc>
+          <w:tcPr>
+            <w:tcW w:type="dxa" w:w="2551"/>
+          </w:tcPr>
+          <w:p>
+            <w:pPr>
+              <w:keepNext/>
+            </w:pPr>
+            <w:r/>
+            <w:r>
+              <w:rPr>
+                <w:sz w:val="19"/>
+              </w:rPr>
+              <w:t>N/A</w:t>
+            </w:r>
+          </w:p>
+        </w:tc>
+      </w:tr>
+    </w:tbl>
+    <w:p>
+      <w:pPr>
+        <w:spacing w:after="40"/>
+      </w:pPr>
+    </w:p>
+    <w:p>
+      <w:pPr>
         <w:keepNext w:val="0"/>
         <w:spacing w:after="80"/>
       </w:pPr>
@@ -1115,7 +1598,7 @@
           <w:i w:val="0"/>
           <w:sz w:val="21"/>
         </w:rPr>
-        <w:t>Schedule of rates: Director $200/hr; Senior Civil Engineer $180/hr; peer review $200/hr; drafting $160/hr. Additional site inspection at Leppington, including travel and report: $1,900 fixed. Provisional sums, only if required: supplementary detail survey $3,500; independent CPEng verification of retaining and containment-interface elements $2,500. JCE's offer will be valid for 120 days from the tender close, to match the head tender.</w:t>
+        <w:t>The fixed site inspection fee of $1,900 covers travel from northern NSW, the inspection and a short report. Phase 4 includes four civil inspections (4 x $1,900) and the hydraulics option two (2 x $1,900). Provisional sums, only if required (excl. GST): PS1 supplementary detail survey $3,500; PS2 independent CPEng verification of retaining and containment-interface elements $2,500; total $6,000. JCE's offer will be valid for 120 days from the tender close of 04/11/2026 (to 04/03/2027), to match the head tender.</w:t>
       </w:r>
     </w:p>
     <w:p>
@@ -1240,7 +1723,7 @@
         <w:rPr>
           <w:sz w:val="21"/>
         </w:rPr>
-        <w:t>the head contract (Vol 3 Annexure Part A, Items 11 to 13; cl 20) requires Public Liability $20 million each and every claim, comprehensive and CTP motor vehicle $20 million, Professional Indemnity not less than $10 million each and every claim (held 7 years after the Term) and workers compensation as required by law. Clause 20.1(c) applies these to sub-consultants. JCE holds PI $10 million any one claim ($20 million aggregate) and Public Liability $10 million. JCE will lift its Public Liability cover to $20 million for this engagement and will supply current certificates of currency for PL, PI, motor vehicle and workers compensation with its final inputs on 21/10/2026.</w:t>
+        <w:t>the head contract (Vol 3 Annexure Part A, Items 11 to 13; cl 20) requires Public Liability $20 million each and every claim, comprehensive and CTP motor vehicle $20 million, Professional Indemnity not less than $10 million each and every claim (held 7 years after the Term) and workers compensation as required by law. Clause 20.1(c) applies these to sub-consultants. JCE holds PI $10 million any one claim ($20 million aggregate) and Public Liability $10 million. JCE will lift its Public Liability cover to $20 million on award, with a certificate of currency before services start. JCE will confirm its motor vehicle and workers compensation position in its final fee proposal on 21/10/2026, and will supply certificates within 48 hours of a request, as the contract requires.</w:t>
       </w:r>
     </w:p>
     <w:p>
@@ -1459,7 +1942,7 @@
               <w:rPr>
                 <w:sz w:val="19"/>
               </w:rPr>
-              <w:t>JCE issues its final fee proposal, Schedule 3 Civil (and Hydraulics) row, rates, Schedule 6 and 10 inputs, CV, capability statement, insurance certificates and WHS documents</w:t>
+              <w:t>JCE issues its final fee proposal, Schedule 3 Civil (and Hydraulics) row, rates, Schedule 6 and 10 inputs, CV, capability statement, current insurance certificates and WHS documents</w:t>
             </w:r>
           </w:p>
         </w:tc>

</xml_diff>

<commit_message>
Mid-Western tender documents filed
Co-Authored-By: Claude Opus 5.5 <noreply@anthropic.com>
Claude-Session: https://claude.ai/code/session_01RKGFyarCMuMinKYL7AiBap
</commit_message>
<xml_diff>
--- a/FP/BUYNSW-T026-2026/Architect-Teaming/JCE_Teaming_Architect-Teaming_Leppington_Final_Brewster-Hjorth.docx
+++ b/FP/BUYNSW-T026-2026/Architect-Teaming/JCE_Teaming_Architect-Teaming_Leppington_Final_Brewster-Hjorth.docx
@@ -1731,7 +1731,7 @@
         <w:rPr>
           <w:sz w:val="21"/>
         </w:rPr>
-        <w:t>RAAF Base Townsville, Defence delivery project: engineering delivery for CPB Contractors (head contractor). Referee: Maverick Partner, CPB Contractors.</w:t>
+        <w:t xml:space="preserve">RAAF Base Townsville, Defence delivery project: engineering delivery for CPB Contractors (head contractor). Referee: Maverick Parker, CPB Contractors.</w:t>
       </w:r>
     </w:p>
     <w:p>
@@ -1743,7 +1743,7 @@
         <w:rPr>
           <w:sz w:val="21"/>
         </w:rPr>
-        <w:t>Tablelands Regional Council (QLD), delivered by Jayden while at Langtrees: floodway rectification on Council's road network, and a landfill leachate storage facility, relevant to the containment and liner interfaces on this site. Referee: Darren Quilliam, Tablelands Regional Council.</w:t>
+        <w:t xml:space="preserve">Tablelands Regional Council (QLD), delivered by Jayden while at Langtree Consulting: floodway rectification on Council's road network, and the Ravenshoe leachate storage facility design modification (2025), relevant to the containment and liner interfaces on this site. Referee: Darren Quilliam, Tablelands Regional Council.</w:t>
       </w:r>
     </w:p>
     <w:p>

</xml_diff>